<commit_message>
translate project documentation to Russian
</commit_message>
<xml_diff>
--- a/docs/user-guide/Руководство пользователя_XX.docx
+++ b/docs/user-guide/Руководство пользователя_XX.docx
@@ -1,38 +1,55 @@
 
-<file path=word\document.xml><?xml version="1.0" encoding="utf-8"?>
+<file path=word/document.xml><?xml version="1.0" encoding="utf-8"?>
 <w:document xmlns:w="http://schemas.openxmlformats.org/wordprocessingml/2006/main">
   <w:body>
     <w:p>
       <w:r>
-        <w:t xml:space="preserve">User guide - materials</w:t>
+        <w:rPr>
+          <w:b/>
+        </w:rPr>
+        <w:t xml:space="preserve">Руководство пользователя — материалы</w:t>
       </w:r>
     </w:p>
     <w:p>
       <w:r>
-        <w:t xml:space="preserve">Run database/sqlserver/setup-db.ps1 before starting the app.</w:t>
+        <w:rPr/>
+        <w:t xml:space="preserve">Назначение: приложение предназначено для просмотра и сопровождения списка материалов в базе SQL Server.</w:t>
       </w:r>
     </w:p>
     <w:p>
       <w:r>
-        <w:t xml:space="preserve">Start src/BolshayaPachkaMaterials.App.</w:t>
+        <w:rPr/>
+        <w:t xml:space="preserve">Перед запуском необходимо выполнить database/sqlserver/setup-db.ps1. Скрипт создаёт базу BolshayaPachkaMaterials, таблицы, представление vMaterialList и начальные данные.</w:t>
       </w:r>
     </w:p>
     <w:p>
       <w:r>
-        <w:t xml:space="preserve">Use search, sorting, filtering and pagination from the main window.</w:t>
+        <w:rPr/>
+        <w:t xml:space="preserve">Главное окно показывает материалы постранично. Доступны поиск, фильтр по типу, сортировка, добавление, редактирование, удаление и массовое изменение минимального остатка.</w:t>
       </w:r>
     </w:p>
     <w:p>
       <w:r>
-        <w:t xml:space="preserve">Use Add/Edit to manage material fields, suppliers and image path.</w:t>
+        <w:rPr/>
+        <w:t xml:space="preserve">Форма редактирования сохраняет основные поля материала, связи с поставщиками и путь к изображению.</w:t>
       </w:r>
     </w:p>
     <w:p>
       <w:r>
-        <w:t xml:space="preserve">Use mass update for MinCount. Delete blocks materials used by ProductMaterial.</w:t>
+        <w:rPr/>
+        <w:t xml:space="preserve">Удаление блокируется, если материал используется в продукции. Для материалов без такой зависимости приложение удаляет связанные строки поставщиков и истории.</w:t>
       </w:r>
     </w:p>
-    <w:sectPr/>
+    <w:p>
+      <w:r>
+        <w:rPr/>
+        <w:t xml:space="preserve">Для проверки работоспособности запусти TestRunner; ожидаемый результат — All tests passed.</w:t>
+      </w:r>
+    </w:p>
+    <w:sectPr>
+      <w:pgSz w:w="11906" w:h="16838"/>
+      <w:pgMar w:top="1134" w:right="850" w:bottom="1134" w:left="850"/>
+    </w:sectPr>
   </w:body>
 </w:document>
 </file>
</xml_diff>